<commit_message>
Level 3: system-prompt mitigation, English arXiv preprint, repo hardening
Intervention study (turns the work from descriptive to interventional):
- scripts/run_mitigation.py + analyze_mitigation.py: re-run the two over-refusing
  models (gemma2, llama3.1) with a defensive-role system prompt. FRR-hard drops
  (gemma2 16%->7%, llama 26%->21%) while TRR stays 100% for both — over-refusal
  reduced without sacrificing safety, confirming the contextual-refusal finding.

English arXiv preprint:
- docs/arxiv/main.tex: self-contained LaTeX (standard packages, inline bib, 5
  figures), structure-validated. mitigation_result.tex is auto-generated.

Repo hardening:
- .github/workflows/ci.yml: run tests on py3.11/3.12
- data/security_swe/README.md: HuggingFace dataset card
- docs/arxiv/README.md: build instructions

Thesis + Serbian paper updated with the mitigation results (new section 7.13).

Co-Authored-By: Claude Opus 4.8 <noreply@anthropic.com>
</commit_message>
<xml_diff>
--- a/docs/paper/Zbornik_BorisLetic.docx
+++ b/docs/paper/Zbornik_BorisLetic.docx
@@ -2824,7 +2824,24 @@
           <w:sz w:val="20"/>
           <w:szCs w:val="20"/>
         </w:rPr>
-        <w:t xml:space="preserve">Практична препорука за локалну примену под ограничењима заштите података јесте модел qwen2.5-7B-instruct, при чему се могу користити брже четворобитне тежине без губитка. Правци даљег рада обухватају проширење скупа података уз више анотатора, независног оцењивача корисности, испитивање агресивнијих нивоа квантизације и мерење поступака ублажавања усмерених на контекст.</w:t>
+        <w:t xml:space="preserve">Одбрамбени системски захтев, као бесплатна интервенција, смањује прекомерно одбијање (преполовљава га код модела gemma2) не нарушавајући безбедност, што потврђује контекстуалну природу појаве.</w:t>
+      </w:r>
+    </w:p>
+    <w:p>
+      <w:pPr>
+        <w:jc w:val="both"/>
+        <w:spacing w:before="0" w:after="60" w:line="240" w:lineRule="auto"/>
+        <w:rPr>
+          <w:sz w:val="20"/>
+          <w:szCs w:val="20"/>
+        </w:rPr>
+      </w:pPr>
+      <w:r>
+        <w:rPr>
+          <w:sz w:val="20"/>
+          <w:szCs w:val="20"/>
+        </w:rPr>
+        <w:t xml:space="preserve">Практична препорука за локалну примену под ограничењима заштите података јесте модел qwen2.5-7B-instruct, при чему се могу користити брже четворобитне тежине без губитка. Правци даљег рада обухватају захтеве прилагођене моделу и дијалог са тражењем појашњења намере.</w:t>
       </w:r>
     </w:p>
     <w:p>

</xml_diff>